<commit_message>
Update TP5_GomezMatias_Fabio Javier Fernandez_Informe.docx
</commit_message>
<xml_diff>
--- a/TP5_GomezMatias_Fabio Javier Fernandez_Informe.docx
+++ b/TP5_GomezMatias_Fabio Javier Fernandez_Informe.docx
@@ -2256,39 +2256,7 @@
           <w:sz w:val="20"/>
           <w:szCs w:val="20"/>
         </w:rPr>
-        <w:t>apl</w:t>
-      </w:r>
-      <w:r>
-        <w:rPr>
-          <w:rFonts w:ascii="Arial" w:hAnsi="Arial" w:cs="Arial"/>
-          <w:sz w:val="20"/>
-          <w:szCs w:val="20"/>
-        </w:rPr>
-        <w:t>icamos</w:t>
-      </w:r>
-      <w:r>
-        <w:rPr>
-          <w:rFonts w:ascii="Arial" w:hAnsi="Arial" w:cs="Arial"/>
-          <w:sz w:val="20"/>
-          <w:szCs w:val="20"/>
-        </w:rPr>
-        <w:t xml:space="preserve"> tres conceptos centrales de</w:t>
-      </w:r>
-      <w:r>
-        <w:rPr>
-          <w:rFonts w:ascii="Arial" w:hAnsi="Arial" w:cs="Arial"/>
-          <w:sz w:val="20"/>
-          <w:szCs w:val="20"/>
-        </w:rPr>
-        <w:t>l</w:t>
-      </w:r>
-      <w:r>
-        <w:rPr>
-          <w:rFonts w:ascii="Arial" w:hAnsi="Arial" w:cs="Arial"/>
-          <w:sz w:val="20"/>
-          <w:szCs w:val="20"/>
-        </w:rPr>
-        <w:t xml:space="preserve"> paradigma de objetos: herencia, clases abstractas y polimorfismo. Los tres apuntan al mismo objetivo: escribir el código común una sola vez y especializar solo lo que cambia.</w:t>
+        <w:t>aplicamos tres conceptos centrales del paradigma de objetos: herencia, clases abstractas y polimorfismo. Los tres apuntan al mismo objetivo: escribir el código común una sola vez y especializar solo lo que cambia.</w:t>
       </w:r>
     </w:p>
     <w:p>
@@ -2356,23 +2324,7 @@
           <w:sz w:val="20"/>
           <w:szCs w:val="20"/>
         </w:rPr>
-        <w:t>Durante el desarrollo de este trabajo práctico nos beneficiamos de uno de los pilares más potentes del paradigma orientado a objetos: la herencia. En lugar de reescribir clases desde cero, pudimos reutilizar las ya existentes de trabajos anteriores y extenderlas. Por ejemplo, en los ejercicios 1 y 2 la clase Persona (TP3) se convirtió en la superclase de Alumno (TP2) y de Empleado</w:t>
-      </w:r>
-      <w:r>
-        <w:rPr>
-          <w:rFonts w:ascii="Arial" w:hAnsi="Arial" w:cs="Arial"/>
-          <w:sz w:val="20"/>
-          <w:szCs w:val="20"/>
-        </w:rPr>
-        <w:t xml:space="preserve">, </w:t>
-      </w:r>
-      <w:r>
-        <w:rPr>
-          <w:rFonts w:ascii="Arial" w:hAnsi="Arial" w:cs="Arial"/>
-          <w:sz w:val="20"/>
-          <w:szCs w:val="20"/>
-        </w:rPr>
-        <w:t xml:space="preserve">"un Alumno </w:t>
+        <w:t xml:space="preserve">Durante el desarrollo de este trabajo práctico nos beneficiamos de uno de los pilares más potentes del paradigma orientado a objetos: la herencia. En lugar de reescribir clases desde cero, pudimos reutilizar las ya existentes de trabajos anteriores y extenderlas. Por ejemplo, en los ejercicios 1 y 2 la clase Persona (TP3) se convirtió en la superclase de Alumno (TP2) y de Empleado, "un Alumno </w:t>
       </w:r>
       <w:r>
         <w:rPr>
@@ -2406,23 +2358,7 @@
           <w:sz w:val="20"/>
           <w:szCs w:val="20"/>
         </w:rPr>
-        <w:t xml:space="preserve"> Persona".</w:t>
-      </w:r>
-      <w:r>
-        <w:rPr>
-          <w:rFonts w:ascii="Arial" w:hAnsi="Arial" w:cs="Arial"/>
-          <w:sz w:val="20"/>
-          <w:szCs w:val="20"/>
-        </w:rPr>
-        <w:t xml:space="preserve"> </w:t>
-      </w:r>
-      <w:r>
-        <w:rPr>
-          <w:rFonts w:ascii="Arial" w:hAnsi="Arial" w:cs="Arial"/>
-          <w:sz w:val="20"/>
-          <w:szCs w:val="20"/>
-        </w:rPr>
-        <w:t xml:space="preserve">Datos como nombre, apellido, DNI y edad, junto con sus </w:t>
+        <w:t xml:space="preserve"> Persona". Datos como nombre, apellido, DNI y edad, junto con sus </w:t>
       </w:r>
       <w:proofErr w:type="spellStart"/>
       <w:r>
@@ -2431,31 +2367,7 @@
           <w:sz w:val="20"/>
           <w:szCs w:val="20"/>
         </w:rPr>
-        <w:t>acces</w:t>
-      </w:r>
-      <w:r>
-        <w:rPr>
-          <w:rFonts w:ascii="Arial" w:hAnsi="Arial" w:cs="Arial"/>
-          <w:sz w:val="20"/>
-          <w:szCs w:val="20"/>
-        </w:rPr>
-        <w:t>s</w:t>
-      </w:r>
-      <w:r>
-        <w:rPr>
-          <w:rFonts w:ascii="Arial" w:hAnsi="Arial" w:cs="Arial"/>
-          <w:sz w:val="20"/>
-          <w:szCs w:val="20"/>
-        </w:rPr>
-        <w:t>or</w:t>
-      </w:r>
-      <w:r>
-        <w:rPr>
-          <w:rFonts w:ascii="Arial" w:hAnsi="Arial" w:cs="Arial"/>
-          <w:sz w:val="20"/>
-          <w:szCs w:val="20"/>
-        </w:rPr>
-        <w:t>s</w:t>
+        <w:t>accessors</w:t>
       </w:r>
       <w:proofErr w:type="spellEnd"/>
       <w:r>
@@ -2464,31 +2376,7 @@
           <w:sz w:val="20"/>
           <w:szCs w:val="20"/>
         </w:rPr>
-        <w:t>, se definieron una única vez en Persona. Alumno y Empleado solo agregan lo</w:t>
-      </w:r>
-      <w:r>
-        <w:rPr>
-          <w:rFonts w:ascii="Arial" w:hAnsi="Arial" w:cs="Arial"/>
-          <w:sz w:val="20"/>
-          <w:szCs w:val="20"/>
-        </w:rPr>
-        <w:t>s atributos propios</w:t>
-      </w:r>
-      <w:r>
-        <w:rPr>
-          <w:rFonts w:ascii="Arial" w:hAnsi="Arial" w:cs="Arial"/>
-          <w:sz w:val="20"/>
-          <w:szCs w:val="20"/>
-        </w:rPr>
-        <w:t xml:space="preserve"> (LU y notas, o CUIL, antigüedad y sueldo), lo que elimina la duplicación de código y reduce los errores</w:t>
-      </w:r>
-      <w:r>
-        <w:rPr>
-          <w:rFonts w:ascii="Arial" w:hAnsi="Arial" w:cs="Arial"/>
-          <w:sz w:val="20"/>
-          <w:szCs w:val="20"/>
-        </w:rPr>
-        <w:t>, a su vez también agregan su comportamiento (métodos) propio o siguiendo con la misma firma que los métodos de su clase padre, pueden reescribir su comportamiento para adaptarlo a lo que sería una forma de comportarse única de la subclase. Como por ejemplo en las clases Premium y Común del ejercicio 11, heredan de la clase abstracta Etiqueta el método precio(), y cada clase realiza los cálculos, agrega formas de descuento o cobra adicionales de manera diferente según especifica la consigna otro ejemplo seria en</w:t>
+        <w:t>, se definieron una única vez en Persona. Alumno y Empleado solo agregan los atributos propios (LU y notas, o CUIL, antigüedad y sueldo), lo que elimina la duplicación de código y reduce los errores, a su vez también agregan su comportamiento (métodos) propio o siguiendo con la misma firma que los métodos de su clase padre, pueden reescribir su comportamiento para adaptarlo a lo que sería una forma de comportarse única de la subclase. Como por ejemplo en las clases Premium y Común del ejercicio 11, heredan de la clase abstracta Etiqueta el método precio(), y cada clase realiza los cálculos, agrega formas de descuento o cobra adicionales de manera diferente según especifica la consigna otro ejemplo seria en</w:t>
       </w:r>
       <w:r>
         <w:rPr>
@@ -2666,87 +2554,7 @@
           <w:sz w:val="20"/>
           <w:szCs w:val="20"/>
         </w:rPr>
-        <w:t xml:space="preserve">También </w:t>
-      </w:r>
-      <w:r>
-        <w:rPr>
-          <w:rFonts w:ascii="Arial" w:hAnsi="Arial" w:cs="Arial"/>
-          <w:sz w:val="20"/>
-          <w:szCs w:val="20"/>
-        </w:rPr>
-        <w:t>trabajamos con clases abstractas, que modelan conceptos que por sí solos no tienen sentido como objetos</w:t>
-      </w:r>
-      <w:r>
-        <w:rPr>
-          <w:rFonts w:ascii="Arial" w:hAnsi="Arial" w:cs="Arial"/>
-          <w:sz w:val="20"/>
-          <w:szCs w:val="20"/>
-        </w:rPr>
-        <w:t xml:space="preserve"> concretos, es decir</w:t>
-      </w:r>
-      <w:r>
-        <w:rPr>
-          <w:rFonts w:ascii="Arial" w:hAnsi="Arial" w:cs="Arial"/>
-          <w:sz w:val="20"/>
-          <w:szCs w:val="20"/>
-        </w:rPr>
-        <w:t xml:space="preserve"> no se puede instanciar</w:t>
-      </w:r>
-      <w:r>
-        <w:rPr>
-          <w:rFonts w:ascii="Arial" w:hAnsi="Arial" w:cs="Arial"/>
-          <w:sz w:val="20"/>
-          <w:szCs w:val="20"/>
-        </w:rPr>
-        <w:t xml:space="preserve"> como un objeto a</w:t>
-      </w:r>
-      <w:r>
-        <w:rPr>
-          <w:rFonts w:ascii="Arial" w:hAnsi="Arial" w:cs="Arial"/>
-          <w:sz w:val="20"/>
-          <w:szCs w:val="20"/>
-        </w:rPr>
-        <w:t xml:space="preserve"> una clase </w:t>
-      </w:r>
-      <w:r>
-        <w:rPr>
-          <w:rFonts w:ascii="Arial" w:hAnsi="Arial" w:cs="Arial"/>
-          <w:sz w:val="20"/>
-          <w:szCs w:val="20"/>
-        </w:rPr>
-        <w:t>abstracta, pero</w:t>
-      </w:r>
-      <w:r>
-        <w:rPr>
-          <w:rFonts w:ascii="Arial" w:hAnsi="Arial" w:cs="Arial"/>
-          <w:sz w:val="20"/>
-          <w:szCs w:val="20"/>
-        </w:rPr>
-        <w:t xml:space="preserve"> sí establecen un </w:t>
-      </w:r>
-      <w:r>
-        <w:rPr>
-          <w:rFonts w:ascii="Arial" w:hAnsi="Arial" w:cs="Arial"/>
-          <w:sz w:val="20"/>
-          <w:szCs w:val="20"/>
-        </w:rPr>
-        <w:t>protocolo</w:t>
-      </w:r>
-      <w:r>
-        <w:rPr>
-          <w:rFonts w:ascii="Arial" w:hAnsi="Arial" w:cs="Arial"/>
-          <w:sz w:val="20"/>
-          <w:szCs w:val="20"/>
-        </w:rPr>
-        <w:t xml:space="preserve"> común para sus subclases</w:t>
-      </w:r>
-      <w:r>
-        <w:rPr>
-          <w:rFonts w:ascii="Arial" w:hAnsi="Arial" w:cs="Arial"/>
-          <w:sz w:val="20"/>
-          <w:szCs w:val="20"/>
-        </w:rPr>
-        <w:t xml:space="preserve"> o clases hijas.</w:t>
+        <w:t>También trabajamos con clases abstractas, que modelan conceptos que por sí solos no tienen sentido como objetos concretos, es decir no se puede instanciar como un objeto a una clase abstracta, pero sí establecen un protocolo común para sus subclases o clases hijas.</w:t>
       </w:r>
     </w:p>
     <w:p>
@@ -2764,15 +2572,7 @@
           <w:sz w:val="20"/>
           <w:szCs w:val="20"/>
         </w:rPr>
-        <w:t>Por ejemplo e</w:t>
-      </w:r>
-      <w:r>
-        <w:rPr>
-          <w:rFonts w:ascii="Arial" w:hAnsi="Arial" w:cs="Arial"/>
-          <w:sz w:val="20"/>
-          <w:szCs w:val="20"/>
-        </w:rPr>
-        <w:t xml:space="preserve">n el ejercicio 7, </w:t>
+        <w:t xml:space="preserve">Por ejemplo en el ejercicio 7, </w:t>
       </w:r>
       <w:proofErr w:type="spellStart"/>
       <w:r>
@@ -2955,95 +2755,7 @@
           <w:sz w:val="20"/>
           <w:szCs w:val="20"/>
         </w:rPr>
-        <w:t>, ya que cada artefacto tiene un cálculo propio</w:t>
-      </w:r>
-      <w:r>
-        <w:rPr>
-          <w:rFonts w:ascii="Arial" w:hAnsi="Arial" w:cs="Arial"/>
-          <w:sz w:val="20"/>
-          <w:szCs w:val="20"/>
-        </w:rPr>
-        <w:t xml:space="preserve">. </w:t>
-      </w:r>
-      <w:r>
-        <w:rPr>
-          <w:rFonts w:ascii="Arial" w:hAnsi="Arial" w:cs="Arial"/>
-          <w:sz w:val="20"/>
-          <w:szCs w:val="20"/>
-        </w:rPr>
-        <w:t>Este enfoque,</w:t>
-      </w:r>
-      <w:r>
-        <w:rPr>
-          <w:rFonts w:ascii="Arial" w:hAnsi="Arial" w:cs="Arial"/>
-          <w:sz w:val="20"/>
-          <w:szCs w:val="20"/>
-        </w:rPr>
-        <w:t xml:space="preserve"> lo</w:t>
-      </w:r>
-      <w:r>
-        <w:rPr>
-          <w:rFonts w:ascii="Arial" w:hAnsi="Arial" w:cs="Arial"/>
-          <w:sz w:val="20"/>
-          <w:szCs w:val="20"/>
-        </w:rPr>
-        <w:t xml:space="preserve"> repetimos en el ejercicio 11 con Etiqueta</w:t>
-      </w:r>
-      <w:r>
-        <w:rPr>
-          <w:rFonts w:ascii="Arial" w:hAnsi="Arial" w:cs="Arial"/>
-          <w:sz w:val="20"/>
-          <w:szCs w:val="20"/>
-        </w:rPr>
-        <w:t xml:space="preserve">, estos ejemplos </w:t>
-      </w:r>
-      <w:r>
-        <w:rPr>
-          <w:rFonts w:ascii="Arial" w:hAnsi="Arial" w:cs="Arial"/>
-          <w:sz w:val="20"/>
-          <w:szCs w:val="20"/>
-        </w:rPr>
-        <w:t>evidencia</w:t>
-      </w:r>
-      <w:r>
-        <w:rPr>
-          <w:rFonts w:ascii="Arial" w:hAnsi="Arial" w:cs="Arial"/>
-          <w:sz w:val="20"/>
-          <w:szCs w:val="20"/>
-        </w:rPr>
-        <w:t>n</w:t>
-      </w:r>
-      <w:r>
-        <w:rPr>
-          <w:rFonts w:ascii="Arial" w:hAnsi="Arial" w:cs="Arial"/>
-          <w:sz w:val="20"/>
-          <w:szCs w:val="20"/>
-        </w:rPr>
-        <w:t xml:space="preserve"> la separación entre qué se debe hacer (definido en la superclase) y cómo se hace (definido en cada subclase)</w:t>
-      </w:r>
-      <w:r>
-        <w:rPr>
-          <w:rFonts w:ascii="Arial" w:hAnsi="Arial" w:cs="Arial"/>
-          <w:sz w:val="20"/>
-          <w:szCs w:val="20"/>
-        </w:rPr>
-        <w:t xml:space="preserve">, en otras palabras, </w:t>
-      </w:r>
-      <w:r>
-        <w:rPr>
-          <w:rFonts w:ascii="Arial" w:hAnsi="Arial" w:cs="Arial"/>
-          <w:sz w:val="20"/>
-          <w:szCs w:val="20"/>
-        </w:rPr>
-        <w:t>la superclase se queda solo con lo esencial y común, y delega los detalles particulares</w:t>
-      </w:r>
-      <w:r>
-        <w:rPr>
-          <w:rFonts w:ascii="Arial" w:hAnsi="Arial" w:cs="Arial"/>
-          <w:sz w:val="20"/>
-          <w:szCs w:val="20"/>
-        </w:rPr>
-        <w:t>.</w:t>
+        <w:t>, ya que cada artefacto tiene un cálculo propio. Este enfoque, lo repetimos en el ejercicio 11 con Etiqueta, estos ejemplos evidencian la separación entre qué se debe hacer (definido en la superclase) y cómo se hace (definido en cada subclase), en otras palabras, la superclase se queda solo con lo esencial y común, y delega los detalles particulares.</w:t>
       </w:r>
     </w:p>
     <w:p>
@@ -3071,15 +2783,7 @@
           <w:sz w:val="20"/>
           <w:szCs w:val="20"/>
         </w:rPr>
-        <w:t>El polimorfismo fue el concepto que permitió aprovechar toda esta estructura. Consiste en que un mismo mensaje produce comportamientos distintos según el objeto que lo recibe, resuelto en tiempo de ejecución mediante la redefinición de métodos.</w:t>
-      </w:r>
-      <w:r>
-        <w:rPr>
-          <w:rFonts w:ascii="Arial" w:hAnsi="Arial" w:cs="Arial"/>
-          <w:sz w:val="20"/>
-          <w:szCs w:val="20"/>
-        </w:rPr>
-        <w:t xml:space="preserve"> </w:t>
+        <w:t xml:space="preserve">El polimorfismo fue el concepto que permitió aprovechar toda esta estructura. Consiste en que un mismo mensaje produce comportamientos distintos según el objeto que lo recibe, resuelto en tiempo de ejecución mediante la redefinición de métodos. </w:t>
       </w:r>
     </w:p>
     <w:p>
@@ -3219,47 +2923,7 @@
           <w:sz w:val="20"/>
           <w:szCs w:val="20"/>
         </w:rPr>
-        <w:t>, e</w:t>
-      </w:r>
-      <w:r>
-        <w:rPr>
-          <w:rFonts w:ascii="Arial" w:hAnsi="Arial" w:cs="Arial"/>
-          <w:sz w:val="20"/>
-          <w:szCs w:val="20"/>
-        </w:rPr>
-        <w:t xml:space="preserve">sto se refleja en un bajo acoplamiento: las clases </w:t>
-      </w:r>
-      <w:r>
-        <w:rPr>
-          <w:rFonts w:ascii="Arial" w:hAnsi="Arial" w:cs="Arial"/>
-          <w:sz w:val="20"/>
-          <w:szCs w:val="20"/>
-        </w:rPr>
-        <w:t>ejecutables</w:t>
-      </w:r>
-      <w:r>
-        <w:rPr>
-          <w:rFonts w:ascii="Arial" w:hAnsi="Arial" w:cs="Arial"/>
-          <w:sz w:val="20"/>
-          <w:szCs w:val="20"/>
-        </w:rPr>
-        <w:t xml:space="preserve"> dependen de la superclase y no de las subclases concretas, por lo que se puede agregar una nueva figura</w:t>
-      </w:r>
-      <w:r>
-        <w:rPr>
-          <w:rFonts w:ascii="Arial" w:hAnsi="Arial" w:cs="Arial"/>
-          <w:sz w:val="20"/>
-          <w:szCs w:val="20"/>
-        </w:rPr>
-        <w:t xml:space="preserve">, </w:t>
-      </w:r>
-      <w:r>
-        <w:rPr>
-          <w:rFonts w:ascii="Arial" w:hAnsi="Arial" w:cs="Arial"/>
-          <w:sz w:val="20"/>
-          <w:szCs w:val="20"/>
-        </w:rPr>
-        <w:t>un nuevo artefacto o un nuevo tipo de etiqueta creando una subclase, sin modificar el código ya probado.</w:t>
+        <w:t>, esto se refleja en un bajo acoplamiento: las clases ejecutables dependen de la superclase y no de las subclases concretas, por lo que se puede agregar una nueva figura, un nuevo artefacto o un nuevo tipo de etiqueta creando una subclase, sin modificar el código ya probado.</w:t>
       </w:r>
     </w:p>
     <w:p>
@@ -3318,23 +2982,7 @@
           <w:szCs w:val="20"/>
         </w:rPr>
         <w:lastRenderedPageBreak/>
-        <w:t xml:space="preserve">Como comprensión final creemos que la herencia </w:t>
-      </w:r>
-      <w:r>
-        <w:rPr>
-          <w:rFonts w:ascii="Arial" w:hAnsi="Arial" w:cs="Arial"/>
-          <w:sz w:val="20"/>
-          <w:szCs w:val="20"/>
-        </w:rPr>
-        <w:t>no reemplaza los conceptos vistos anteriormente, sino que se apoya en ellos. El encapsulamiento y la ocultación de la información se mantuvieron: los atributos siguen siendo privados y se accede a ellos a través de la interfaz pública</w:t>
-      </w:r>
-      <w:r>
-        <w:rPr>
-          <w:rFonts w:ascii="Arial" w:hAnsi="Arial" w:cs="Arial"/>
-          <w:sz w:val="20"/>
-          <w:szCs w:val="20"/>
-        </w:rPr>
-        <w:t xml:space="preserve"> y quisiéramos destacar el uso muy útil de </w:t>
+        <w:t xml:space="preserve">Como comprensión final creemos que la herencia no reemplaza los conceptos vistos anteriormente, sino que se apoya en ellos. El encapsulamiento y la ocultación de la información se mantuvieron: los atributos siguen siendo privados y se accede a ellos a través de la interfaz pública y quisiéramos destacar el uso muy útil de </w:t>
       </w:r>
       <w:r>
         <w:rPr>
@@ -3415,35 +3063,7 @@
           <w:sz w:val="20"/>
           <w:szCs w:val="20"/>
         </w:rPr>
-        <w:t xml:space="preserve"> y Exclusivo, nos permitió extender el comportamiento heredado en lugar de reemplazarlo, aprovechando al </w:t>
-      </w:r>
-      <w:r>
-        <w:rPr>
-          <w:rFonts w:ascii="Arial" w:hAnsi="Arial" w:cs="Arial"/>
-          <w:sz w:val="20"/>
-          <w:szCs w:val="20"/>
-        </w:rPr>
-        <w:t xml:space="preserve">máximo lo heredado por una clase padre. </w:t>
-      </w:r>
-      <w:r>
-        <w:rPr>
-          <w:rFonts w:ascii="Arial" w:hAnsi="Arial" w:cs="Arial"/>
-          <w:sz w:val="20"/>
-          <w:szCs w:val="20"/>
-        </w:rPr>
-        <w:t xml:space="preserve">En conjunto, la herencia, las clases abstractas y el polimorfismo </w:t>
-      </w:r>
-      <w:r>
-        <w:t xml:space="preserve">hicieron que el software sea más </w:t>
-      </w:r>
-      <w:r>
-        <w:t xml:space="preserve">extensible, </w:t>
-      </w:r>
-      <w:r>
-        <w:t xml:space="preserve">mantenible y fácil </w:t>
-      </w:r>
-      <w:r>
-        <w:t>de entender.</w:t>
+        <w:t xml:space="preserve"> y Exclusivo, nos permitió extender el comportamiento heredado en lugar de reemplazarlo, aprovechando al máximo lo heredado por una clase padre. En conjunto, la herencia, las clases abstractas y el polimorfismo hicieron que el software sea más extensible, mantenible y fácil de entender.</w:t>
       </w:r>
     </w:p>
     <w:sectPr>

</xml_diff>